<commit_message>
LLP307 Session1 booklet v3: add Fonti 2023 as key reading (9 theory streams explained), 4 readings total
</commit_message>
<xml_diff>
--- a/LLP307_第一堂课_上课备用_最终.docx
+++ b/LLP307_第一堂课_上课备用_最终.docx
@@ -175,17 +175,7 @@
         <w:rPr>
           <w:color w:val="1F3B6E"/>
         </w:rPr>
-        <w:t>二、提前阅读文献（四骨架精读）</w:t>
-      </w:r>
-    </w:p>
-    <w:p>
-      <w:r>
-        <w:rPr>
-          <w:b w:val="0"/>
-          <w:color w:val="888888"/>
-          <w:sz w:val="18"/>
-        </w:rPr>
-        <w:t>说明：以下按「判类型→套骨架→中英对照→关键原句」的标准格式。</w:t>
+        <w:t>二、课前阅读文献（四骨架精读 · 共4篇）</w:t>
       </w:r>
     </w:p>
     <w:p>
@@ -196,7 +186,7 @@
         <w:rPr>
           <w:color w:val="2E5A9E"/>
         </w:rPr>
-        <w:t>1. Troilo et al. (2016) — Perception vs Reality ｜ Omega 59:72–83</w:t>
+        <w:t>1. Alamar (2013) 第1章 — Introduction to Sports Analytics</w:t>
       </w:r>
     </w:p>
     <w:p>
@@ -205,10 +195,10 @@
           <w:b/>
           <w:color w:val="C00000"/>
         </w:rPr>
-        <w:t>【类型】骨架① 实证研究</w:t>
+        <w:t>【类型】骨架③ 理论/框架文（书章节）</w:t>
       </w:r>
       <w:r>
-        <w:t xml:space="preserve">　— 有一手数据（57名经理样本，probit+OLS+同时方程）</w:t>
+        <w:t xml:space="preserve">　— 无一手数据，提出分析项目四要素框架</w:t>
       </w:r>
     </w:p>
     <w:p>
@@ -216,10 +206,10 @@
         <w:rPr>
           <w:b/>
         </w:rPr>
-        <w:t>significance / 意义：</w:t>
+        <w:t>thesis / 主张：</w:t>
       </w:r>
       <w:r>
-        <w:t>职业体育用分析提升场上表现广为人知，但用分析提升商业表现鲜有研究；北美球队是区域合法垄断。</w:t>
+        <w:t>建分析项目不直截了当；但理解其组成要素，能最大化竞争优势。</w:t>
       </w:r>
     </w:p>
     <w:p>
@@ -231,7 +221,7 @@
           <w:i/>
           <w:color w:val="202020"/>
         </w:rPr>
-        <w:t>原文：“It is well known that professional sports teams have made extensive use of analytics to improve their on-field performance. However, it is not as apparent that these same organizations use analytics to improve performance on the ‘business’ side.”</w:t>
+        <w:t>原文：“implementing an analytics program to gain a competitive advantage is not a straightforward process … understanding the components of an analytics program will help managers maximize the competitive advantage.”</w:t>
       </w:r>
     </w:p>
     <w:p>
@@ -239,10 +229,10 @@
         <w:rPr>
           <w:b/>
         </w:rPr>
-        <w:t>aim / 目的：</w:t>
+        <w:t>framework / 四要素：</w:t>
       </w:r>
       <w:r>
-        <w:t>探索组织对商业分析的“采用与评估”——管理者的感知 vs 实际财务表现变化。</w:t>
+        <w:t>① 数据管理 ② 预测分析模型 ③ 信息系统 ④ 领导力（“第四只脚”，有它才能满值）。</w:t>
       </w:r>
     </w:p>
     <w:p>
@@ -254,7 +244,7 @@
           <w:i/>
           <w:color w:val="202020"/>
         </w:rPr>
-        <w:t>原文：“An empirical analysis is conducted concerning management’s perception of the effects of business analytics as well as the actual change in financial performance…”</w:t>
+        <w:t>原文：“without leadership … no analytic investment will reach its full potential.”</w:t>
       </w:r>
     </w:p>
     <w:p>
@@ -262,10 +252,10 @@
         <w:rPr>
           <w:b/>
         </w:rPr>
-        <w:t>carried out / 方法：</w:t>
+        <w:t>“体育分析”定义：</w:t>
       </w:r>
       <w:r>
-        <w:t>实证；构建 Analytics Index（数据采集/分析/规划三成分）；probit + OLS + 同时方程处理内生性。</w:t>
+        <w:t>管理结构化历史数据 + 应用预测模型 + 用信息系统告知决策者，以获取竞争优势。</w:t>
       </w:r>
     </w:p>
     <w:p>
@@ -277,7 +267,7 @@
           <w:i/>
           <w:color w:val="202020"/>
         </w:rPr>
-        <w:t>原文：“the simultaneous probit model is the appropriate methodology to account for potential endogeneity between two binary dependent variables.”</w:t>
+        <w:t>原文：“the management of structured historical data, the application of predictive analytic models … and the use of information systems to inform decision makers.”</w:t>
       </w:r>
     </w:p>
     <w:p>
@@ -285,10 +275,10 @@
         <w:rPr>
           <w:b/>
         </w:rPr>
-        <w:t>finding / 主效应：</w:t>
+        <w:t>两大目标：</w:t>
       </w:r>
       <w:r>
-        <w:t>两个贡献：① 首创可推广的 Analytics Index ② 桥接经济理性与合法性理性，二者可并存。</w:t>
+        <w:t>① 省时间 ② 给新洞察。</w:t>
       </w:r>
     </w:p>
     <w:p>
@@ -300,76 +290,7 @@
           <w:i/>
           <w:color w:val="202020"/>
         </w:rPr>
-        <w:t>原文：“We see two contributions to management literature in the above findings.”</w:t>
-      </w:r>
-    </w:p>
-    <w:p>
-      <w:r>
-        <w:rPr>
-          <w:b/>
-        </w:rPr>
-        <w:t>further finding / 关键数字：</w:t>
-      </w:r>
-      <w:r>
-        <w:t>实际增收 7.2%（行业仅 3%），但“感知”与现实脱节；成本端“感知压过现实”。</w:t>
-      </w:r>
-    </w:p>
-    <w:p>
-      <w:pPr>
-        <w:ind w:left="432"/>
-      </w:pPr>
-      <w:r>
-        <w:rPr>
-          <w:i/>
-          <w:color w:val="202020"/>
-        </w:rPr>
-        <w:t>原文：“an increase of 7.2% in the third model… revenue should increase by 7.2%…” / “In the realm of costs, perception reigns over reality in our sample.”</w:t>
-      </w:r>
-    </w:p>
-    <w:p>
-      <w:r>
-        <w:rPr>
-          <w:b/>
-        </w:rPr>
-        <w:t>implication / 启示：</w:t>
-      </w:r>
-      <w:r>
-        <w:t>采用分析可能只是“合法性模仿”，未必带来真实回报；财务信息被私有制隔离，外人只能想象。</w:t>
-      </w:r>
-    </w:p>
-    <w:p>
-      <w:pPr>
-        <w:ind w:left="432"/>
-      </w:pPr>
-      <w:r>
-        <w:rPr>
-          <w:i/>
-          <w:color w:val="202020"/>
-        </w:rPr>
-        <w:t>原文：“financial information is sequestered due to the private ownership structure… managers outside this group… may imagine positive outcomes.”</w:t>
-      </w:r>
-    </w:p>
-    <w:p>
-      <w:r>
-        <w:rPr>
-          <w:b/>
-        </w:rPr>
-        <w:t>future / 局限：</w:t>
-      </w:r>
-      <w:r>
-        <w:t>需区分采用动机（经济 vs 合法性）及长期效果；线性概率模型违反 OLS 假设。</w:t>
-      </w:r>
-    </w:p>
-    <w:p>
-      <w:pPr>
-        <w:ind w:left="432"/>
-      </w:pPr>
-      <w:r>
-        <w:rPr>
-          <w:i/>
-          <w:color w:val="202020"/>
-        </w:rPr>
-        <w:t>原文：“Future work may attempt to analyze the extent to which industry characteristics may drive mixed motives of management.”</w:t>
+        <w:t>原文：“Good analytics systems provide decision makers time to analyze relevant information instead of gathering it.”</w:t>
       </w:r>
     </w:p>
     <w:p>
@@ -388,10 +309,10 @@
         <w:rPr>
           <w:color w:val="202020"/>
         </w:rPr>
-        <w:t>“In the realm of costs, perception reigns over reality.”</w:t>
+        <w:t>“analytic models provide information; they do not make decisions.”</w:t>
       </w:r>
       <w:r>
-        <w:t xml:space="preserve">　｜ 成本端，感知压过现实。</w:t>
+        <w:t xml:space="preserve">　｜ 模型提供信息，不做决策。</w:t>
       </w:r>
     </w:p>
     <w:p>
@@ -402,18 +323,10 @@
         <w:rPr>
           <w:color w:val="202020"/>
         </w:rPr>
-        <w:t>“the use of analytics correlates with revenue growth of 7.2% in the year following adoption.”</w:t>
+        <w:t>“Analysis of bad data cannot reliably produce good information.”</w:t>
       </w:r>
       <w:r>
-        <w:t xml:space="preserve">　｜ 采用分析后一年增收 7.2%。</w:t>
-      </w:r>
-    </w:p>
-    <w:p>
-      <w:r>
-        <w:rPr>
-          <w:b w:val="0"/>
-        </w:rPr>
-        <w:t>【对作业的用处】Question &amp; Why It Matters + Approach &amp; Limits；最适合 Business 域（Sponsorship/Ticket/Media）。</w:t>
+        <w:t xml:space="preserve">　｜ 坏数据产不出好信息。</w:t>
       </w:r>
     </w:p>
     <w:p/>
@@ -425,7 +338,7 @@
         <w:rPr>
           <w:color w:val="2E5A9E"/>
         </w:rPr>
-        <w:t>2. Read &amp; Smith (2023) — Data as Capital ｜ Convergence 29(5)</w:t>
+        <w:t>2. Miller (2016) 第1章 — Understanding Sports Markets</w:t>
       </w:r>
     </w:p>
     <w:p>
@@ -434,43 +347,10 @@
           <w:b/>
           <w:color w:val="C00000"/>
         </w:rPr>
-        <w:t>【类型】骨架③ 理论/概念文</w:t>
+        <w:t>【类型】骨架③ 理论框架（书章节，含实证图表）</w:t>
       </w:r>
       <w:r>
-        <w:t xml:space="preserve">　— 无一手数据，Bourdieu 资本理论 + 三案例论证</w:t>
-      </w:r>
-    </w:p>
-    <w:p>
-      <w:r>
-        <w:rPr>
-          <w:b w:val="0"/>
-          <w:color w:val="C00000"/>
-          <w:sz w:val="18"/>
-        </w:rPr>
-        <w:t>⚠️ 作者 Daniel Read = 你的 ISB 导师（d.read3）。</w:t>
-      </w:r>
-    </w:p>
-    <w:p>
-      <w:r>
-        <w:rPr>
-          <w:b/>
-        </w:rPr>
-        <w:t>gap / 问题：</w:t>
-      </w:r>
-      <w:r>
-        <w:t>职业体育进入数字经济，组织采纳数据驱动商业模式创新，但伦理脆弱性未被审视。</w:t>
-      </w:r>
-    </w:p>
-    <w:p>
-      <w:pPr>
-        <w:ind w:left="432"/>
-      </w:pPr>
-      <w:r>
-        <w:rPr>
-          <w:i/>
-          <w:color w:val="202020"/>
-        </w:rPr>
-        <w:t>原文：“Professional sport has entered the digital economy as organisations adopt data-driven business model innovations… to highlight the potential ethical vulnerabilities…”</w:t>
+        <w:t xml:space="preserve">　— 从经济学视角看体育市场</w:t>
       </w:r>
     </w:p>
     <w:p>
@@ -481,7 +361,7 @@
         <w:t>thesis / 主张：</w:t>
       </w:r>
       <w:r>
-        <w:t>把数据当“资本”（Bourdieu），经商业模式创新转经济资本；揭示大数据提取如何加剧组织-球迷权力不对等。</w:t>
+        <w:t>职业体育是特殊市场：球队既竞争又合作，核心产品是“比赛”这一联合产品。</w:t>
       </w:r>
     </w:p>
     <w:p>
@@ -493,7 +373,7 @@
           <w:i/>
           <w:color w:val="202020"/>
         </w:rPr>
-        <w:t>原文：“we treat data as a species of capital that can be converted into economic capital… it reveals how the extraction and application of big data exacerbates inequitable power relationships… the big data divide.”</w:t>
+        <w:t>原文：“professional sport … teams compete with each other while cooperating as league members.”</w:t>
       </w:r>
     </w:p>
     <w:p>
@@ -501,10 +381,10 @@
         <w:rPr>
           <w:b/>
         </w:rPr>
-        <w:t>framework / 结构：</w:t>
+        <w:t>关键知识1：竞争平衡：</w:t>
       </w:r>
       <w:r>
-        <w:t>Bourdieu 资本转换：数据资本 ↔ 经济/社会/文化资本；代价是消耗象征资本（球迷信任/品牌）。</w:t>
+        <w:t>一支队总赢反而降低观众兴趣；“赢大多数”好过“赢所有”。</w:t>
       </w:r>
     </w:p>
     <w:p>
@@ -516,7 +396,7 @@
           <w:i/>
           <w:color w:val="202020"/>
         </w:rPr>
-        <w:t>原文：“data-driven business model innovation transforms data into economic capital at the expense of symbolic capital.”</w:t>
+        <w:t>原文：（联盟声称追求 competitive balance）</w:t>
       </w:r>
     </w:p>
     <w:p>
@@ -524,10 +404,10 @@
         <w:rPr>
           <w:b/>
         </w:rPr>
-        <w:t>论证依据：</w:t>
+        <w:t>关键知识2：工资与胜利：</w:t>
       </w:r>
       <w:r>
-        <w:t>三大概念：big data divide（大数据鸿沟）、prosumer fan（产消型球迷）、digital enclosure（数字围合）。</w:t>
+        <w:t>英足名次 60–90% 由工资解释；但 MLB 胜率仅 &lt;7% 由薪资解释 → 呼应 Moneyball“精明花钱”。</w:t>
       </w:r>
     </w:p>
     <w:p>
@@ -539,7 +419,30 @@
           <w:i/>
           <w:color w:val="202020"/>
         </w:rPr>
-        <w:t>原文：“the big data divide – that leads to ethical vulnerabilities for sport organisations and their consumers.”</w:t>
+        <w:t>原文：“between 60 and 90 percent of the variability in U.K. soccer team positions may be explained by wages…” / “less than 7 percent … is explained by player payrolls.”</w:t>
+      </w:r>
+    </w:p>
+    <w:p>
+      <w:r>
+        <w:rPr>
+          <w:b/>
+        </w:rPr>
+        <w:t>关键知识3：薪资分布：</w:t>
+      </w:r>
+      <w:r>
+        <w:t>右偏（正偏态）：少数明星拉高均值（NFL 平均170万 vs 中位数63万）。</w:t>
+      </w:r>
+    </w:p>
+    <w:p>
+      <w:pPr>
+        <w:ind w:left="432"/>
+      </w:pPr>
+      <w:r>
+        <w:rPr>
+          <w:i/>
+          <w:color w:val="202020"/>
+        </w:rPr>
+        <w:t>原文：（图1.2 数据）</w:t>
       </w:r>
     </w:p>
     <w:p>
@@ -558,24 +461,10 @@
         <w:rPr>
           <w:color w:val="202020"/>
         </w:rPr>
-        <w:t>“the extraction and application of big data exacerbates inequitable power relationships… the big data divide.”</w:t>
+        <w:t>“less than 7 percent of the variability in win/loss percentages is explained by player payrolls.”</w:t>
       </w:r>
       <w:r>
-        <w:t xml:space="preserve">　｜ 大数据提取加剧权力不对等——大数据鸿沟。</w:t>
-      </w:r>
-    </w:p>
-    <w:p>
-      <w:pPr>
-        <w:pStyle w:val="ListBullet"/>
-      </w:pPr>
-      <w:r>
-        <w:rPr>
-          <w:color w:val="202020"/>
-        </w:rPr>
-        <w:t>“data-driven business model innovation transforms data into economic capital at the expense of symbolic capital.”</w:t>
-      </w:r>
-      <w:r>
-        <w:t xml:space="preserve">　｜ 以消耗象征资本（信任）换经济资本。</w:t>
+        <w:t xml:space="preserve">　｜ MLB 胜率仅 &lt;7% 由薪资解释。</w:t>
       </w:r>
     </w:p>
     <w:p>
@@ -583,7 +472,7 @@
         <w:rPr>
           <w:b w:val="0"/>
         </w:rPr>
-        <w:t>【对作业的用处】Approach &amp; Its Limits 的伦理视角；Business 或 Sports Science 域都可用。</w:t>
+        <w:t>【作业用处】最适合 Business 域（Sponsorship/Ticket/Media）的市场背景。</w:t>
       </w:r>
     </w:p>
     <w:p/>
@@ -595,441 +484,7 @@
         <w:rPr>
           <w:color w:val="2E5A9E"/>
         </w:rPr>
-        <w:t>3. Houtmeyers et al. (2021) — 描述到处方 ｜ IJSPP</w:t>
-      </w:r>
-    </w:p>
-    <w:p>
-      <w:r>
-        <w:rPr>
-          <w:b/>
-          <w:color w:val="C00000"/>
-        </w:rPr>
-        <w:t>【类型】骨架③ 理论框架/评论</w:t>
-      </w:r>
-      <w:r>
-        <w:t xml:space="preserve">　— 概念/评论文，把商业分析四阶梯迁移到精英体育</w:t>
-      </w:r>
-    </w:p>
-    <w:p>
-      <w:r>
-        <w:rPr>
-          <w:b/>
-        </w:rPr>
-        <w:t>thesis / 主张：</w:t>
-      </w:r>
-      <w:r>
-        <w:t>分析四阶梯 descriptive→diagnostic→predictive→prescriptive，价值与难度递增。</w:t>
-      </w:r>
-    </w:p>
-    <w:p>
-      <w:pPr>
-        <w:ind w:left="432"/>
-      </w:pPr>
-      <w:r>
-        <w:rPr>
-          <w:i/>
-          <w:color w:val="202020"/>
-        </w:rPr>
-        <w:t>原文：“the four-step analytics ladder: descriptive → diagnostic → predictive → prescriptive.”</w:t>
-      </w:r>
-    </w:p>
-    <w:p>
-      <w:r>
-        <w:rPr>
-          <w:b/>
-        </w:rPr>
-        <w:t>framework / 结构：</w:t>
-      </w:r>
-      <w:r>
-        <w:t>前两阶理解过去，后两阶指导未来；描述/诊断/预测=inform，只有处方=drive。</w:t>
-      </w:r>
-    </w:p>
-    <w:p>
-      <w:pPr>
-        <w:ind w:left="432"/>
-      </w:pPr>
-      <w:r>
-        <w:rPr>
-          <w:i/>
-          <w:color w:val="202020"/>
-        </w:rPr>
-        <w:t>原文：“the current use of data in elite sport is more focused on informing decisions rather than driving them.”</w:t>
-      </w:r>
-    </w:p>
-    <w:p>
-      <w:r>
-        <w:rPr>
-          <w:b/>
-        </w:rPr>
-        <w:t>应用价值：</w:t>
-      </w:r>
-      <w:r>
-        <w:t>精英体育当前是 data-informed（数据知情）而非 data-driven（数据驱动）；重复仪表盘有确认偏见风险。</w:t>
-      </w:r>
-    </w:p>
-    <w:p>
-      <w:pPr>
-        <w:ind w:left="432"/>
-      </w:pPr>
-      <w:r>
-        <w:rPr>
-          <w:i/>
-          <w:color w:val="202020"/>
-        </w:rPr>
-        <w:t>原文：“prescriptive analytics… provide optimal decision options and their consequences.”</w:t>
-      </w:r>
-    </w:p>
-    <w:p>
-      <w:r>
-        <w:rPr>
-          <w:b/>
-        </w:rPr>
-        <w:t>【关键原句】</w:t>
-      </w:r>
-    </w:p>
-    <w:p>
-      <w:pPr>
-        <w:pStyle w:val="ListBullet"/>
-      </w:pPr>
-      <w:r>
-        <w:rPr>
-          <w:color w:val="202020"/>
-        </w:rPr>
-        <w:t>“the current use of data in elite sport is more focused on informing decisions rather than driving them.”</w:t>
-      </w:r>
-      <w:r>
-        <w:t xml:space="preserve">　｜ 更多是“告知”而非“驱动”决策。</w:t>
-      </w:r>
-    </w:p>
-    <w:p>
-      <w:pPr>
-        <w:pStyle w:val="ListBullet"/>
-      </w:pPr>
-      <w:r>
-        <w:rPr>
-          <w:color w:val="202020"/>
-        </w:rPr>
-        <w:t>“garbage in, garbage out.”</w:t>
-      </w:r>
-      <w:r>
-        <w:t xml:space="preserve">　｜ 垃圾进，垃圾出。</w:t>
-      </w:r>
-    </w:p>
-    <w:p>
-      <w:r>
-        <w:rPr>
-          <w:b w:val="0"/>
-        </w:rPr>
-        <w:t>【对作业的用处】Choosing &amp; Cleaning Data（数据质量是前提）+ Approach &amp; Limits（complexity vs timeliness 权衡）。</w:t>
-      </w:r>
-    </w:p>
-    <w:p/>
-    <w:p>
-      <w:pPr>
-        <w:pStyle w:val="Heading2"/>
-      </w:pPr>
-      <w:r>
-        <w:rPr>
-          <w:color w:val="2E5A9E"/>
-        </w:rPr>
-        <w:t>4. Travassos et al. (2013) — 生态动力学 ｜ IJPA 13(1)</w:t>
-      </w:r>
-    </w:p>
-    <w:p>
-      <w:r>
-        <w:rPr>
-          <w:b/>
-          <w:color w:val="C00000"/>
-        </w:rPr>
-        <w:t>【类型】骨架③ 理论框架</w:t>
-      </w:r>
-      <w:r>
-        <w:t xml:space="preserve">　— 理论文，用过往足球+futsal数据佐证</w:t>
-      </w:r>
-    </w:p>
-    <w:p>
-      <w:r>
-        <w:rPr>
-          <w:b/>
-        </w:rPr>
-        <w:t>gap / 问题：</w:t>
-      </w:r>
-      <w:r>
-        <w:t>传统性能分析只记录离散行为类别，脱离表现情境和人际互动。</w:t>
-      </w:r>
-    </w:p>
-    <w:p>
-      <w:pPr>
-        <w:ind w:left="432"/>
-      </w:pPr>
-      <w:r>
-        <w:rPr>
-          <w:i/>
-          <w:color w:val="202020"/>
-        </w:rPr>
-        <w:t>原文：“focused on recording discrete categories of behaviours… little reference to the performance context.”</w:t>
-      </w:r>
-    </w:p>
-    <w:p>
-      <w:r>
-        <w:rPr>
-          <w:b/>
-        </w:rPr>
-        <w:t>thesis / 主张：</w:t>
-      </w:r>
-      <w:r>
-        <w:t>表现从个体/子群体/球队与对手的持续时空互动中“涌现”，离散指标没框架就没意义。</w:t>
-      </w:r>
-    </w:p>
-    <w:p>
-      <w:pPr>
-        <w:ind w:left="432"/>
-      </w:pPr>
-      <w:r>
-        <w:rPr>
-          <w:i/>
-          <w:color w:val="202020"/>
-        </w:rPr>
-        <w:t>原文：“performance emerges from continuous spatiotemporal interactions… (emergent behaviour).”</w:t>
-      </w:r>
-    </w:p>
-    <w:p>
-      <w:r>
-        <w:rPr>
-          <w:b/>
-        </w:rPr>
-        <w:t>framework / 结构：</w:t>
-      </w:r>
-      <w:r>
-        <w:t>三层次：dyadic（双人）/ subgroup（子群体）/ team（队级）；核心命题=把有意义信息交给能用的教练。</w:t>
-      </w:r>
-    </w:p>
-    <w:p>
-      <w:pPr>
-        <w:ind w:left="432"/>
-      </w:pPr>
-      <w:r>
-        <w:rPr>
-          <w:i/>
-          <w:color w:val="202020"/>
-        </w:rPr>
-        <w:t>原文：“the key proposition is to deliver meaningful information to coaches/managers who can use it.”</w:t>
-      </w:r>
-    </w:p>
-    <w:p>
-      <w:r>
-        <w:rPr>
-          <w:b/>
-        </w:rPr>
-        <w:t>【关键原句】</w:t>
-      </w:r>
-    </w:p>
-    <w:p>
-      <w:pPr>
-        <w:pStyle w:val="ListBullet"/>
-      </w:pPr>
-      <w:r>
-        <w:rPr>
-          <w:color w:val="202020"/>
-        </w:rPr>
-        <w:t>“focused on recording discrete categories of behaviours… little reference to the performance context.”</w:t>
-      </w:r>
-      <w:r>
-        <w:t xml:space="preserve">　｜ 只记离散行为，不参照情境。</w:t>
-      </w:r>
-    </w:p>
-    <w:p>
-      <w:r>
-        <w:rPr>
-          <w:b w:val="0"/>
-        </w:rPr>
-        <w:t>【对作业的用处】Area of Interest（Tactical/Performance）+ Question &amp; Why（为什么离散指标不够）。⚠️ 大量 futsal 案例，与你背景强相关。</w:t>
-      </w:r>
-    </w:p>
-    <w:p/>
-    <w:p>
-      <w:pPr>
-        <w:pStyle w:val="Heading2"/>
-      </w:pPr>
-      <w:r>
-        <w:rPr>
-          <w:color w:val="2E5A9E"/>
-        </w:rPr>
-        <w:t>5. Alamar (2013) Ch1 — Sports Analytics ｜ 书章节</w:t>
-      </w:r>
-    </w:p>
-    <w:p>
-      <w:r>
-        <w:rPr>
-          <w:b/>
-          <w:color w:val="C00000"/>
-        </w:rPr>
-        <w:t>【类型】骨架③ 理论框架（书章节）</w:t>
-      </w:r>
-      <w:r>
-        <w:t xml:space="preserve">　— 框架/概念文</w:t>
-      </w:r>
-    </w:p>
-    <w:p>
-      <w:r>
-        <w:rPr>
-          <w:b/>
-        </w:rPr>
-        <w:t>gap / 问题：</w:t>
-      </w:r>
-      <w:r>
-        <w:t>建分析项目不直截了当——“implementing an analytics program… is not a straightforward process.”</w:t>
-      </w:r>
-    </w:p>
-    <w:p>
-      <w:pPr>
-        <w:ind w:left="432"/>
-      </w:pPr>
-      <w:r>
-        <w:rPr>
-          <w:i/>
-          <w:color w:val="202020"/>
-        </w:rPr>
-        <w:t>原文：“implementing an analytics program to gain a competitive advantage is not a straightforward process.”</w:t>
-      </w:r>
-    </w:p>
-    <w:p>
-      <w:r>
-        <w:rPr>
-          <w:b/>
-        </w:rPr>
-        <w:t>thesis / 主张：</w:t>
-      </w:r>
-      <w:r>
-        <w:t>理解分析项目四要素，才能最大化竞争优势（数据管理/预测模型/信息系统/领导力）。</w:t>
-      </w:r>
-    </w:p>
-    <w:p>
-      <w:pPr>
-        <w:ind w:left="432"/>
-      </w:pPr>
-      <w:r>
-        <w:rPr>
-          <w:i/>
-          <w:color w:val="202020"/>
-        </w:rPr>
-        <w:t>原文：“understanding the components of an analytics program will help managers maximize the competitive advantage…”</w:t>
-      </w:r>
-    </w:p>
-    <w:p>
-      <w:r>
-        <w:rPr>
-          <w:b/>
-        </w:rPr>
-        <w:t>framework / 结构：</w:t>
-      </w:r>
-      <w:r>
-        <w:t>四要素，前三者是工具，领导力是“第四只脚”。</w:t>
-      </w:r>
-    </w:p>
-    <w:p>
-      <w:pPr>
-        <w:ind w:left="432"/>
-      </w:pPr>
-      <w:r>
-        <w:rPr>
-          <w:i/>
-          <w:color w:val="202020"/>
-        </w:rPr>
-        <w:t>原文：“without leadership… no analytic investment will reach its full potential.”</w:t>
-      </w:r>
-    </w:p>
-    <w:p>
-      <w:r>
-        <w:rPr>
-          <w:b/>
-        </w:rPr>
-        <w:t>论证依据：</w:t>
-      </w:r>
-      <w:r>
-        <w:t>SAUS 调查（27名 NFL/MLB/NBA/英超代表）：60%用5+信息源，仅31.3%数据集中化。</w:t>
-      </w:r>
-    </w:p>
-    <w:p>
-      <w:pPr>
-        <w:ind w:left="432"/>
-      </w:pPr>
-      <w:r>
-        <w:rPr>
-          <w:i/>
-          <w:color w:val="202020"/>
-        </w:rPr>
-        <w:t>原文：“Analysis of bad data cannot reliably produce good information.”</w:t>
-      </w:r>
-    </w:p>
-    <w:p>
-      <w:r>
-        <w:rPr>
-          <w:b/>
-        </w:rPr>
-        <w:t>【关键原句】</w:t>
-      </w:r>
-    </w:p>
-    <w:p>
-      <w:pPr>
-        <w:pStyle w:val="ListBullet"/>
-      </w:pPr>
-      <w:r>
-        <w:rPr>
-          <w:color w:val="202020"/>
-        </w:rPr>
-        <w:t>“analytic models provide information; they do not make decisions.”</w:t>
-      </w:r>
-      <w:r>
-        <w:t xml:space="preserve">　｜ 分析模型提供信息，不做决策。</w:t>
-      </w:r>
-    </w:p>
-    <w:p>
-      <w:pPr>
-        <w:pStyle w:val="ListBullet"/>
-      </w:pPr>
-      <w:r>
-        <w:rPr>
-          <w:color w:val="202020"/>
-        </w:rPr>
-        <w:t>“Good analytics systems provide decision makers time to analyze relevant information instead of gathering it.”</w:t>
-      </w:r>
-      <w:r>
-        <w:t xml:space="preserve">　｜ 好系统给决策者时间去分析，而不是收集。</w:t>
-      </w:r>
-    </w:p>
-    <w:p>
-      <w:pPr>
-        <w:pStyle w:val="ListBullet"/>
-      </w:pPr>
-      <w:r>
-        <w:rPr>
-          <w:color w:val="202020"/>
-        </w:rPr>
-        <w:t>“Analysis of bad data cannot reliably produce good information.”</w:t>
-      </w:r>
-      <w:r>
-        <w:t xml:space="preserve">　｜ 坏数据无法产出好信息。</w:t>
-      </w:r>
-    </w:p>
-    <w:p>
-      <w:r>
-        <w:rPr>
-          <w:b w:val="0"/>
-        </w:rPr>
-        <w:t>【对作业的用处】四要素框架贯穿全文；领导力要素直接对应旧题“领导力类型”，今年可用在 Approach &amp; Limits。</w:t>
-      </w:r>
-    </w:p>
-    <w:p/>
-    <w:p>
-      <w:pPr>
-        <w:pStyle w:val="Heading2"/>
-      </w:pPr>
-      <w:r>
-        <w:rPr>
-          <w:color w:val="2E5A9E"/>
-        </w:rPr>
-        <w:t>6. Davenport (2014) — Analytics in Sports ｜ 行业报告</w:t>
+        <w:t>3. Davenport (2014) — Analytics in Sports: The New Science of Winning</w:t>
       </w:r>
     </w:p>
     <w:p>
@@ -1041,7 +496,7 @@
         <w:t>【类型】骨架④ 行业报告</w:t>
       </w:r>
       <w:r>
-        <w:t xml:space="preserve">　— 28页行业报告，非期刊</w:t>
+        <w:t xml:space="preserve">　— 28页报告（SAS 赞助，访谈25支球队/联盟代表）</w:t>
       </w:r>
     </w:p>
     <w:p>
@@ -1049,10 +504,10 @@
         <w:rPr>
           <w:b/>
         </w:rPr>
-        <w:t>领域全景 / 背景：</w:t>
+        <w:t>领域全景（7特性）：</w:t>
       </w:r>
       <w:r>
-        <w:t>体育是分析最活跃行业，7 特性：球迷爱分析/多领域/多渠道/Moneyball放大/数据暴涨/教练流动传播/大会壮大。</w:t>
+        <w:t>球迷爱分析/多领域/多渠道/Moneyball放大/数据暴涨/教练流动传播/大会壮大。</w:t>
       </w:r>
     </w:p>
     <w:p>
@@ -1064,7 +519,7 @@
           <w:i/>
           <w:color w:val="202020"/>
         </w:rPr>
-        <w:t>原文：“Many industries today are adopting more analytical approaches to decision-making. However, no other industry has the same types of analytical initiatives underway as professional sports.”</w:t>
+        <w:t>原文：“no other industry has the same types of analytical initiatives underway as professional sports.”</w:t>
       </w:r>
     </w:p>
     <w:p>
@@ -1072,10 +527,10 @@
         <w:rPr>
           <w:b/>
         </w:rPr>
-        <w:t>盘点结论（主）：</w:t>
+        <w:t>核心结论：</w:t>
       </w:r>
       <w:r>
-        <w:t>决策者对体育分析的“需求”远小于“供给”。</w:t>
+        <w:t>决策者对分析的“需求”远小于“供给”。</w:t>
       </w:r>
     </w:p>
     <w:p>
@@ -1098,7 +553,7 @@
         <w:t>补充结论：</w:t>
       </w:r>
       <w:r>
-        <w:t>球队本质小企业（前台~100人）；table stakes vs frontier；分析帮小球市；不替代好教练。</w:t>
+        <w:t>球队是小企业（前台~100人）；table stakes vs frontier；分析帮小球市；不替代好教练。</w:t>
       </w:r>
     </w:p>
     <w:p>
@@ -1118,6 +573,29 @@
         <w:rPr>
           <w:b/>
         </w:rPr>
+        <w:t>驱动三词（已核实）：</w:t>
+      </w:r>
+      <w:r>
+        <w:t>Sam Allardyce 总结：faith（信任）、proof（证据）、determination（决心）。</w:t>
+      </w:r>
+    </w:p>
+    <w:p>
+      <w:pPr>
+        <w:ind w:left="432"/>
+      </w:pPr>
+      <w:r>
+        <w:rPr>
+          <w:i/>
+          <w:color w:val="202020"/>
+        </w:rPr>
+        <w:t>原文：“faith, proof, determination” (p.13)</w:t>
+      </w:r>
+    </w:p>
+    <w:p>
+      <w:r>
+        <w:rPr>
+          <w:b/>
+        </w:rPr>
         <w:t>【关键原句】</w:t>
       </w:r>
     </w:p>
@@ -1129,7 +607,7 @@
         <w:rPr>
           <w:color w:val="202020"/>
         </w:rPr>
-        <w:t>“demand… is considerably less than the supply of data, technology, new metrics, and analytics.”</w:t>
+        <w:t>“demand … is considerably less than the supply …”</w:t>
       </w:r>
       <w:r>
         <w:t xml:space="preserve">　｜ 需求远小于供给。</w:t>
@@ -1143,10 +621,10 @@
         <w:rPr>
           <w:color w:val="202020"/>
         </w:rPr>
-        <w:t>“analytics has not and will not replace strong players and good coaching… they have become important augmentation.”</w:t>
+        <w:t>“analytics has not and will not replace strong players and good coaching.”</w:t>
       </w:r>
       <w:r>
-        <w:t xml:space="preserve">　｜ 分析不替代好球员教练，是重要增强。</w:t>
+        <w:t xml:space="preserve">　｜ 分析不替代好球员教练。</w:t>
       </w:r>
     </w:p>
     <w:p>
@@ -1154,7 +632,7 @@
         <w:rPr>
           <w:b w:val="0"/>
         </w:rPr>
-        <w:t>【对作业的用处】作业 background 明确引用这篇（“many industries today are adopting…”）。</w:t>
+        <w:t>【作业用处】作业 background 明确引用这篇。</w:t>
       </w:r>
     </w:p>
     <w:p>
@@ -1164,13 +642,433 @@
     </w:p>
     <w:p>
       <w:pPr>
+        <w:pStyle w:val="Heading2"/>
+      </w:pPr>
+      <w:r>
+        <w:rPr>
+          <w:color w:val="2E5A9E"/>
+        </w:rPr>
+        <w:t>4. Fonti, Ross &amp; Aversa (2023) — ⭐ 本节重点阅读 ｜ Journal of Management 49(1)</w:t>
+      </w:r>
+    </w:p>
+    <w:p>
+      <w:r>
+        <w:rPr>
+          <w:b/>
+          <w:color w:val="C00000"/>
+        </w:rPr>
+        <w:t>【类型】骨架② 综述类（systematic review，249篇）</w:t>
+      </w:r>
+      <w:r>
+        <w:t xml:space="preserve">　— 整合1972–2021年FT50管理期刊用体育数据的研究</w:t>
+      </w:r>
+    </w:p>
+    <w:p>
+      <w:r>
+        <w:rPr>
+          <w:b/>
+        </w:rPr>
+        <w:t>综述范围：</w:t>
+      </w:r>
+      <w:r>
+        <w:t>梳理 249 篇用体育数据推进管理理论的研究，总结优点+缺点+未来方向。</w:t>
+      </w:r>
+    </w:p>
+    <w:p>
+      <w:pPr>
+        <w:ind w:left="432"/>
+      </w:pPr>
+      <w:r>
+        <w:rPr>
+          <w:i/>
+          <w:color w:val="202020"/>
+        </w:rPr>
+        <w:t>原文：“Of the 249 studies … 52% have been published since 2010 and 34% since 2015.”</w:t>
+      </w:r>
+    </w:p>
+    <w:p>
+      <w:r>
+        <w:rPr>
+          <w:b/>
+        </w:rPr>
+        <w:t>核心论点：</w:t>
+      </w:r>
+      <w:r>
+        <w:t>体育数据对管理研究既是机会也是陷阱——“不是万能药（not a panacea）”。</w:t>
+      </w:r>
+    </w:p>
+    <w:p>
+      <w:pPr>
+        <w:ind w:left="432"/>
+      </w:pPr>
+      <w:r>
+        <w:rPr>
+          <w:i/>
+          <w:color w:val="202020"/>
+        </w:rPr>
+        <w:t>原文：“such positive features are not a panacea, as several drawbacks are also associated with leveraging sports data.”</w:t>
+      </w:r>
+    </w:p>
+    <w:p>
+      <w:r>
+        <w:rPr>
+          <w:b/>
+        </w:rPr>
+        <w:t>优点：</w:t>
+      </w:r>
+      <w:r>
+        <w:t>概念上：理论建构/激进理论化；实证上：三角验证/复现；价值：体育是“相关却疏离”场域，对抗街灯效应。</w:t>
+      </w:r>
+    </w:p>
+    <w:p>
+      <w:pPr>
+        <w:ind w:left="432"/>
+      </w:pPr>
+      <w:r>
+        <w:rPr>
+          <w:i/>
+          <w:color w:val="202020"/>
+        </w:rPr>
+        <w:t>原文：（优点 vs 缺点辩证）</w:t>
+      </w:r>
+    </w:p>
+    <w:p>
+      <w:r>
+        <w:rPr>
+          <w:b/>
+        </w:rPr>
+        <w:t>缺点（最该记）：</w:t>
+      </w:r>
+      <w:r>
+        <w:t>① 过度简化匹配 → 过度概括风险 ② 外部效度是最大障碍（69% 受访者）。</w:t>
+      </w:r>
+    </w:p>
+    <w:p>
+      <w:pPr>
+        <w:ind w:left="432"/>
+      </w:pPr>
+      <w:r>
+        <w:rPr>
+          <w:i/>
+          <w:color w:val="202020"/>
+        </w:rPr>
+        <w:t>原文：“an oversimplification of the match between the sports context and given management phenomena, which might result in overgeneralization.” / “A ‘lack of external validity’ was rated as the biggest challenge (69%).”</w:t>
+      </w:r>
+    </w:p>
+    <w:p>
+      <w:r>
+        <w:rPr>
+          <w:b/>
+        </w:rPr>
+        <w:t>未来方向（gap）：</w:t>
+      </w:r>
+      <w:r>
+        <w:t>不平等（性别薪酬差/种族）、宏大挑战（气候/可持续）、时间概化。</w:t>
+      </w:r>
+    </w:p>
+    <w:p>
+      <w:pPr>
+        <w:ind w:left="432"/>
+      </w:pPr>
+      <w:r>
+        <w:rPr>
+          <w:i/>
+          <w:color w:val="202020"/>
+        </w:rPr>
+        <w:t>原文：（Future Directions 节）</w:t>
+      </w:r>
+    </w:p>
+    <w:p>
+      <w:pPr>
+        <w:pStyle w:val="Heading3"/>
+      </w:pPr>
+      <w:r>
+        <w:rPr>
+          <w:color w:val="446AB3"/>
+        </w:rPr>
+        <w:t>⭐ Fonti 总结的 9 条管理理论流派（逐条解释）</w:t>
+      </w:r>
+    </w:p>
+    <w:p>
+      <w:r>
+        <w:rPr>
+          <w:b w:val="0"/>
+          <w:color w:val="888888"/>
+          <w:sz w:val="18"/>
+        </w:rPr>
+        <w:t>说明：原文明确列出 9 条（含 unethical behavior）。</w:t>
+      </w:r>
+    </w:p>
+    <w:p>
+      <w:pPr>
+        <w:pStyle w:val="ListBullet"/>
+      </w:pPr>
+      <w:r>
+        <w:rPr>
+          <w:b/>
+        </w:rPr>
+        <w:t>1. 资源基础观 Resource-Based View (RBV)：</w:t>
+      </w:r>
+      <w:r>
+        <w:t>竞争优势来自组织拥有的独特、稀缺、难模仿的资源。</w:t>
+      </w:r>
+    </w:p>
+    <w:p>
+      <w:pPr>
+        <w:ind w:left="504"/>
+      </w:pPr>
+      <w:r>
+        <w:t>例子：研究球队如何把球员/教练/数据等资源“捆绑部署”赢得竞争。</w:t>
+      </w:r>
+    </w:p>
+    <w:p>
+      <w:pPr>
+        <w:pStyle w:val="ListBullet"/>
+      </w:pPr>
+      <w:r>
+        <w:rPr>
+          <w:b/>
+        </w:rPr>
+        <w:t>2. 地位与声誉 Status &amp; Reputation：</w:t>
+      </w:r>
+      <w:r>
+        <w:t>组织间因声望排名产生的竞争行为（想往上爬、怕掉下来）。</w:t>
+      </w:r>
+    </w:p>
+    <w:p>
+      <w:pPr>
+        <w:ind w:left="504"/>
+      </w:pPr>
+      <w:r>
+        <w:t>例子：豪门靠名牌吸引球星，普通队靠成绩提升声誉。</w:t>
+      </w:r>
+    </w:p>
+    <w:p>
+      <w:pPr>
+        <w:pStyle w:val="ListBullet"/>
+      </w:pPr>
+      <w:r>
+        <w:rPr>
+          <w:b/>
+        </w:rPr>
+        <w:t>3. 网络理论 Network-related theory：</w:t>
+      </w:r>
+      <w:r>
+        <w:t>组织通过关系网络（转会、合作、人脉）获取资源与信息。</w:t>
+      </w:r>
+    </w:p>
+    <w:p>
+      <w:pPr>
+        <w:ind w:left="504"/>
+      </w:pPr>
+      <w:r>
+        <w:t>例子：转会市场上经纪人—俱乐部—球员的关系网。</w:t>
+      </w:r>
+    </w:p>
+    <w:p>
+      <w:pPr>
+        <w:pStyle w:val="ListBullet"/>
+      </w:pPr>
+      <w:r>
+        <w:rPr>
+          <w:b/>
+        </w:rPr>
+        <w:t>4. 竞争/敌对 Rivalry：</w:t>
+      </w:r>
+      <w:r>
+        <w:t>对手关系如何影响组织决策与绩效。</w:t>
+      </w:r>
+    </w:p>
+    <w:p>
+      <w:pPr>
+        <w:ind w:left="504"/>
+      </w:pPr>
+      <w:r>
+        <w:t>例子：德比战（利物浦vs曼联）能激发更高投入。</w:t>
+      </w:r>
+    </w:p>
+    <w:p>
+      <w:pPr>
+        <w:pStyle w:val="ListBullet"/>
+      </w:pPr>
+      <w:r>
+        <w:rPr>
+          <w:b/>
+        </w:rPr>
+        <w:t>5. 风险承担 Risk-taking：</w:t>
+      </w:r>
+      <w:r>
+        <w:t>组织在不确定下的风险偏好如何影响决策。</w:t>
+      </w:r>
+    </w:p>
+    <w:p>
+      <w:pPr>
+        <w:ind w:left="504"/>
+      </w:pPr>
+      <w:r>
+        <w:t>例子：保级队最后几轮“搏命”换阵 vs 稳健打法。</w:t>
+      </w:r>
+    </w:p>
+    <w:p>
+      <w:pPr>
+        <w:pStyle w:val="ListBullet"/>
+      </w:pPr>
+      <w:r>
+        <w:rPr>
+          <w:b/>
+        </w:rPr>
+        <w:t>6. 决策制定 Decision-making：</w:t>
+      </w:r>
+      <w:r>
+        <w:t>决策中的偏误、直觉、信息处理。</w:t>
+      </w:r>
+    </w:p>
+    <w:p>
+      <w:pPr>
+        <w:ind w:left="504"/>
+      </w:pPr>
+      <w:r>
+        <w:t>例子：教练临场换人是否理性，还是受“热手效应”等偏误影响。</w:t>
+      </w:r>
+    </w:p>
+    <w:p>
+      <w:pPr>
+        <w:pStyle w:val="ListBullet"/>
+      </w:pPr>
+      <w:r>
+        <w:rPr>
+          <w:b/>
+        </w:rPr>
+        <w:t>7. 动机 Motivation：</w:t>
+      </w:r>
+      <w:r>
+        <w:t>什么激励个体/团队（公平理论、期望理论）。</w:t>
+      </w:r>
+    </w:p>
+    <w:p>
+      <w:pPr>
+        <w:ind w:left="504"/>
+      </w:pPr>
+      <w:r>
+        <w:t>例子：球员薪资公平感如何影响表现（同工不同酬争议）。</w:t>
+      </w:r>
+    </w:p>
+    <w:p>
+      <w:pPr>
+        <w:pStyle w:val="ListBullet"/>
+      </w:pPr>
+      <w:r>
+        <w:rPr>
+          <w:b/>
+        </w:rPr>
+        <w:t>8. 领导力 Leadership：</w:t>
+      </w:r>
+      <w:r>
+        <w:t>领导者如何影响、激励团队达成目标。</w:t>
+      </w:r>
+    </w:p>
+    <w:p>
+      <w:pPr>
+        <w:ind w:left="504"/>
+      </w:pPr>
+      <w:r>
+        <w:t>例子：名帅（弗格森、瓜迪奥拉）的管理风格对球队的影响。</w:t>
+      </w:r>
+    </w:p>
+    <w:p>
+      <w:pPr>
+        <w:pStyle w:val="ListBullet"/>
+      </w:pPr>
+      <w:r>
+        <w:rPr>
+          <w:b/>
+        </w:rPr>
+        <w:t>9. 不道德行为 Unethical behavior：</w:t>
+      </w:r>
+      <w:r>
+        <w:t>组织/个体在道德边界的越轨行为。</w:t>
+      </w:r>
+    </w:p>
+    <w:p>
+      <w:pPr>
+        <w:ind w:left="504"/>
+      </w:pPr>
+      <w:r>
+        <w:t>例子：假球、兴奋剂、腐败——治理与伦理议题。</w:t>
+      </w:r>
+    </w:p>
+    <w:p>
+      <w:r>
+        <w:rPr>
+          <w:b/>
+        </w:rPr>
+        <w:t>【关键原句】</w:t>
+      </w:r>
+    </w:p>
+    <w:p>
+      <w:pPr>
+        <w:pStyle w:val="ListBullet"/>
+      </w:pPr>
+      <w:r>
+        <w:rPr>
+          <w:color w:val="202020"/>
+        </w:rPr>
+        <w:t>“such positive features are not a panacea…”</w:t>
+      </w:r>
+      <w:r>
+        <w:t xml:space="preserve">　｜ 优点不是万能药。</w:t>
+      </w:r>
+    </w:p>
+    <w:p>
+      <w:pPr>
+        <w:pStyle w:val="ListBullet"/>
+      </w:pPr>
+      <w:r>
+        <w:rPr>
+          <w:color w:val="202020"/>
+        </w:rPr>
+        <w:t>“A ‘lack of external validity’ was rated as the biggest challenge (69%).”</w:t>
+      </w:r>
+      <w:r>
+        <w:t xml:space="preserve">　｜ 外部效度是最大障碍（69%）。</w:t>
+      </w:r>
+    </w:p>
+    <w:p>
+      <w:pPr>
+        <w:pStyle w:val="ListBullet"/>
+      </w:pPr>
+      <w:r>
+        <w:rPr>
+          <w:color w:val="202020"/>
+        </w:rPr>
+        <w:t>“52% have been published since 2010 and 34% since 2015.”</w:t>
+      </w:r>
+      <w:r>
+        <w:t xml:space="preserve">　｜ 近十年爆发式增长。</w:t>
+      </w:r>
+    </w:p>
+    <w:p>
+      <w:r>
+        <w:rPr>
+          <w:b w:val="0"/>
+        </w:rPr>
+        <w:t>【作业用处】与 Analyst's Decision Brief 高度相关：Choosing &amp; Cleaning Data 段（警惕过度概括/外部效度）+ Area of Interest 段（从9条流派选一个框定背景）。</w:t>
+      </w:r>
+    </w:p>
+    <w:p>
+      <w:r>
+        <w:br w:type="page"/>
+      </w:r>
+    </w:p>
+    <w:p>
+      <w:pPr>
         <w:pStyle w:val="Heading1"/>
       </w:pPr>
       <w:r>
         <w:rPr>
           <w:color w:val="1F3B6E"/>
         </w:rPr>
-        <w:t>三、五篇文献共同主线（记住一句话）</w:t>
+        <w:t>三、四篇文献的共同主线（记住一句话）</w:t>
       </w:r>
     </w:p>
     <w:p>
@@ -1186,7 +1084,7 @@
         <w:pStyle w:val="ListBullet"/>
       </w:pPr>
       <w:r>
-        <w:t>Davenport —— 供给 &gt; 需求（数据有，没人用）</w:t>
+        <w:t>Alamar —— 分析项目怎么搭（四要素+领导力）</w:t>
       </w:r>
     </w:p>
     <w:p>
@@ -1194,7 +1092,7 @@
         <w:pStyle w:val="ListBullet"/>
       </w:pPr>
       <w:r>
-        <w:t>Houtmeyers —— 停在 inform（告知）到不了 drive（驱动）</w:t>
+        <w:t>Miller —— 体育市场特殊（钱 ≠ 赢球）</w:t>
       </w:r>
     </w:p>
     <w:p>
@@ -1202,7 +1100,7 @@
         <w:pStyle w:val="ListBullet"/>
       </w:pPr>
       <w:r>
-        <w:t>Travassos —— 离散指标没框架就没意义</w:t>
+        <w:t>Davenport —— 全行业供给&gt;需求（瓶颈在文化不在技术）</w:t>
       </w:r>
     </w:p>
     <w:p>
@@ -1210,15 +1108,7 @@
         <w:pStyle w:val="ListBullet"/>
       </w:pPr>
       <w:r>
-        <w:t>Troilo —— 感知 vs 现实脱节（合法性模仿）</w:t>
-      </w:r>
-    </w:p>
-    <w:p>
-      <w:pPr>
-        <w:pStyle w:val="ListBullet"/>
-      </w:pPr>
-      <w:r>
-        <w:t>Read &amp; Smith —— 数据=权力，伦理风险</w:t>
+        <w:t>Fonti —— 体育数据做研究的范式地图（优点不是万能药，警惕过度概括+外部效度）</w:t>
       </w:r>
     </w:p>
     <w:p>
@@ -1521,7 +1411,15 @@
         <w:pStyle w:val="ListBullet"/>
       </w:pPr>
       <w:r>
-        <w:t>big data divide — 大数据鸿沟</w:t>
+        <w:t>external validity / generalizability — 外部效度 / 可推广性</w:t>
+      </w:r>
+    </w:p>
+    <w:p>
+      <w:pPr>
+        <w:pStyle w:val="ListBullet"/>
+      </w:pPr>
+      <w:r>
+        <w:t>overgeneralization — 过度概括</w:t>
       </w:r>
     </w:p>
     <w:p>
@@ -1538,14 +1436,6 @@
       </w:pPr>
       <w:r>
         <w:t>word count — 字数</w:t>
-      </w:r>
-    </w:p>
-    <w:p>
-      <w:pPr>
-        <w:pStyle w:val="ListBullet"/>
-      </w:pPr>
-      <w:r>
-        <w:t>assessment / submission date — 评估 / 截止日期</w:t>
       </w:r>
     </w:p>
     <w:p>

</xml_diff>